<commit_message>
redone non tech questions
</commit_message>
<xml_diff>
--- a/NonTechQuestions/fingerprint_biometrics_blog.docx
+++ b/NonTechQuestions/fingerprint_biometrics_blog.docx
@@ -32,7 +32,6 @@
           <w:szCs w:val="18"/>
         </w:rPr>
       </w:pPr>
-      <w:proofErr w:type="spellStart"/>
       <w:r>
         <w:rPr>
           <w:rFonts w:ascii="Courier New" w:eastAsia="Courier New" w:hAnsi="Courier New" w:cs="Courier New"/>
@@ -40,17 +39,7 @@
           <w:sz w:val="22"/>
           <w:szCs w:val="22"/>
         </w:rPr>
-        <w:t>WattIsElectronics</w:t>
-      </w:r>
-      <w:proofErr w:type="spellEnd"/>
-      <w:r>
-        <w:rPr>
-          <w:rFonts w:ascii="Courier New" w:eastAsia="Courier New" w:hAnsi="Courier New" w:cs="Courier New"/>
-          <w:color w:val="AAAAAA"/>
-          <w:sz w:val="22"/>
-          <w:szCs w:val="22"/>
-        </w:rPr>
-        <w:t>· Biometrics Edition</w:t>
+        <w:t>WattIsElectronics· Biometrics Edition</w:t>
       </w:r>
       <w:r>
         <w:rPr>
@@ -74,9 +63,8 @@
           <w:sz w:val="18"/>
           <w:szCs w:val="18"/>
         </w:rPr>
-        <w:t xml:space="preserve">Written </w:t>
-      </w:r>
-      <w:proofErr w:type="gramStart"/>
+        <w:t>Written by</w:t>
+      </w:r>
       <w:r>
         <w:rPr>
           <w:rFonts w:ascii="Courier New" w:eastAsia="Courier New" w:hAnsi="Courier New" w:cs="Courier New"/>
@@ -84,35 +72,8 @@
           <w:sz w:val="18"/>
           <w:szCs w:val="18"/>
         </w:rPr>
-        <w:t>by</w:t>
-      </w:r>
-      <w:r>
-        <w:rPr>
-          <w:rFonts w:ascii="Courier New" w:eastAsia="Courier New" w:hAnsi="Courier New" w:cs="Courier New"/>
-          <w:color w:val="AAAAAA"/>
-          <w:sz w:val="18"/>
-          <w:szCs w:val="18"/>
-        </w:rPr>
-        <w:t>:-</w:t>
-      </w:r>
-      <w:proofErr w:type="gramEnd"/>
-      <w:r>
-        <w:rPr>
-          <w:rFonts w:ascii="Courier New" w:eastAsia="Courier New" w:hAnsi="Courier New" w:cs="Courier New"/>
-          <w:color w:val="AAAAAA"/>
-          <w:sz w:val="18"/>
-          <w:szCs w:val="18"/>
-        </w:rPr>
-        <w:t>Gaurish Bansal</w:t>
-      </w:r>
-    </w:p>
-    <w:p>
-      <w:pPr>
-        <w:pBdr>
-          <w:bottom w:val="single" w:sz="2" w:space="1" w:color="E0E0E0"/>
-        </w:pBdr>
-        <w:spacing w:before="200" w:after="200"/>
-      </w:pPr>
+        <w:t>:-Gaurish Bansal</w:t>
+      </w:r>
     </w:p>
     <w:p>
       <w:pPr>
@@ -141,27 +102,7 @@
           <w:sz w:val="52"/>
           <w:szCs w:val="52"/>
         </w:rPr>
-        <w:t xml:space="preserve">But </w:t>
-      </w:r>
-      <w:proofErr w:type="gramStart"/>
-      <w:r>
-        <w:rPr>
-          <w:b/>
-          <w:bCs/>
-          <w:sz w:val="52"/>
-          <w:szCs w:val="52"/>
-        </w:rPr>
-        <w:t>How</w:t>
-      </w:r>
-      <w:proofErr w:type="gramEnd"/>
-      <w:r>
-        <w:rPr>
-          <w:b/>
-          <w:bCs/>
-          <w:sz w:val="52"/>
-          <w:szCs w:val="52"/>
-        </w:rPr>
-        <w:t>?</w:t>
+        <w:t>But How?</w:t>
       </w:r>
     </w:p>
     <w:p>
@@ -199,14 +140,6 @@
         </w:rPr>
         <w:t xml:space="preserve"> from skin ridges to silicon sensors to cryptographic vaults.</w:t>
       </w:r>
-    </w:p>
-    <w:p>
-      <w:pPr>
-        <w:pBdr>
-          <w:bottom w:val="single" w:sz="2" w:space="1" w:color="E0E0E0"/>
-        </w:pBdr>
-        <w:spacing w:before="200" w:after="200"/>
-      </w:pPr>
     </w:p>
     <w:p>
       <w:pPr>
@@ -413,9 +346,8 @@
                   <w14:round/>
                 </w14:textOutline>
               </w:rPr>
-              <w:t xml:space="preserve"> not even between identical twins who share the exact same DNA. The ridges on your fingertip form entirely at random during </w:t>
-            </w:r>
-            <w:proofErr w:type="spellStart"/>
+              <w:t xml:space="preserve"> not even between identical twins who share the exact same DNA. The ridges on your fingertip form entirely at random during fet</w:t>
+            </w:r>
             <w:r>
               <w:rPr>
                 <w:i/>
@@ -434,7 +366,7 @@
                   <w14:round/>
                 </w14:textOutline>
               </w:rPr>
-              <w:t>fet</w:t>
+              <w:t>us</w:t>
             </w:r>
             <w:r>
               <w:rPr>
@@ -454,27 +386,6 @@
                   <w14:round/>
                 </w14:textOutline>
               </w:rPr>
-              <w:t>us</w:t>
-            </w:r>
-            <w:proofErr w:type="spellEnd"/>
-            <w:r>
-              <w:rPr>
-                <w:i/>
-                <w:iCs/>
-                <w:color w:val="4472C4" w:themeColor="accent1"/>
-                <w:sz w:val="22"/>
-                <w:szCs w:val="22"/>
-                <w14:shadow w14:blurRad="38100" w14:dist="25400" w14:dir="5400000" w14:sx="100000" w14:sy="100000" w14:kx="0" w14:ky="0" w14:algn="ctr">
-                  <w14:srgbClr w14:val="6E747A">
-                    <w14:alpha w14:val="57000"/>
-                  </w14:srgbClr>
-                </w14:shadow>
-                <w14:textOutline w14:w="0" w14:cap="flat" w14:cmpd="sng" w14:algn="ctr">
-                  <w14:noFill/>
-                  <w14:prstDash w14:val="solid"/>
-                  <w14:round/>
-                </w14:textOutline>
-              </w:rPr>
               <w:t xml:space="preserve"> development, shaped by tiny physical forces in the womb. Your fingerprint is, in the most literal sense, a biological accident that became your unique ID.</w:t>
             </w:r>
           </w:p>
@@ -582,7 +493,6 @@
         <w:pStyle w:val="Heading3"/>
       </w:pPr>
       <w:r>
-        <w:lastRenderedPageBreak/>
         <w:t xml:space="preserve">Minutiae </w:t>
       </w:r>
       <w:r>
@@ -617,7 +527,11 @@
         <w:t>ridge endings</w:t>
       </w:r>
       <w:r>
-        <w:t xml:space="preserve">), they form little islands. These micro-features are called </w:t>
+        <w:t xml:space="preserve">), they form </w:t>
+      </w:r>
+      <w:r>
+        <w:lastRenderedPageBreak/>
+        <w:t xml:space="preserve">little islands. These micro-features are called </w:t>
       </w:r>
       <w:r>
         <w:rPr>
@@ -824,14 +738,6 @@
     </w:p>
     <w:p>
       <w:pPr>
-        <w:pBdr>
-          <w:bottom w:val="single" w:sz="2" w:space="1" w:color="E0E0E0"/>
-        </w:pBdr>
-        <w:spacing w:before="200" w:after="200"/>
-      </w:pPr>
-    </w:p>
-    <w:p>
-      <w:pPr>
         <w:spacing w:before="360" w:after="60"/>
       </w:pPr>
       <w:r>
@@ -1056,6 +962,7 @@
         <w:spacing w:before="80" w:after="160"/>
       </w:pPr>
       <w:r>
+        <w:lastRenderedPageBreak/>
         <w:t>The idea is almost simple: shine light on your finger, take a photo of what bounces back. The OLED display flashes bright light onto your fingertip. Ridges in contact with the glass reflect light differently than valleys, which have a tiny air gap. A camera sensor beneath the display captures this pattern.</w:t>
       </w:r>
     </w:p>
@@ -1076,58 +983,101 @@
     <w:p>
       <w:pPr>
         <w:pStyle w:val="Heading3"/>
-      </w:pPr>
-      <w:r>
+        <w:rPr>
+          <w:color w:val="EE0000"/>
+        </w:rPr>
+      </w:pPr>
+      <w:r>
+        <w:rPr>
+          <w:color w:val="EE0000"/>
+        </w:rPr>
         <w:t xml:space="preserve">3. Ultrasonic Sensors </w:t>
       </w:r>
       <w:r>
+        <w:rPr>
+          <w:color w:val="EE0000"/>
+        </w:rPr>
         <w:t>-</w:t>
       </w:r>
       <w:r>
+        <w:rPr>
+          <w:color w:val="EE0000"/>
+        </w:rPr>
         <w:t xml:space="preserve"> the precise one</w:t>
       </w:r>
     </w:p>
     <w:p>
       <w:pPr>
         <w:spacing w:before="80" w:after="160"/>
-      </w:pPr>
-      <w:r>
+        <w:rPr>
+          <w:color w:val="EE0000"/>
+        </w:rPr>
+      </w:pPr>
+      <w:r>
+        <w:rPr>
+          <w:color w:val="EE0000"/>
+        </w:rPr>
         <w:t xml:space="preserve">The most sophisticated type </w:t>
       </w:r>
       <w:r>
+        <w:rPr>
+          <w:color w:val="EE0000"/>
+        </w:rPr>
         <w:t>-</w:t>
       </w:r>
       <w:r>
+        <w:rPr>
+          <w:color w:val="EE0000"/>
+        </w:rPr>
         <w:t xml:space="preserve"> used in Samsung's high-end Galaxy phones.</w:t>
       </w:r>
     </w:p>
     <w:p>
       <w:pPr>
         <w:spacing w:before="80" w:after="160"/>
-      </w:pPr>
-      <w:r>
+        <w:rPr>
+          <w:color w:val="EE0000"/>
+        </w:rPr>
+      </w:pPr>
+      <w:r>
+        <w:rPr>
+          <w:color w:val="EE0000"/>
+        </w:rPr>
         <w:t xml:space="preserve">Instead of light or capacitance, it fires ultrasonic sound pulses at your finger. The sound bounces back from ridges and valleys with different intensities and time delays. The sensor measures these reflections and builds a </w:t>
       </w:r>
       <w:r>
         <w:rPr>
           <w:b/>
           <w:bCs/>
+          <w:color w:val="EE0000"/>
         </w:rPr>
         <w:t>3D map</w:t>
       </w:r>
       <w:r>
+        <w:rPr>
+          <w:color w:val="EE0000"/>
+        </w:rPr>
         <w:t xml:space="preserve"> of your fingerprint </w:t>
       </w:r>
       <w:r>
+        <w:rPr>
+          <w:color w:val="EE0000"/>
+        </w:rPr>
         <w:t>-</w:t>
       </w:r>
       <w:r>
+        <w:rPr>
+          <w:color w:val="EE0000"/>
+        </w:rPr>
         <w:t xml:space="preserve"> not a flat image, an actual depth map.</w:t>
       </w:r>
     </w:p>
     <w:p>
       <w:pPr>
         <w:spacing w:after="120"/>
+        <w:rPr>
+          <w:color w:val="EE0000"/>
+        </w:rPr>
       </w:pPr>
     </w:p>
     <w:tbl>
@@ -1172,7 +1122,7 @@
             <w:pPr>
               <w:spacing w:after="60"/>
               <w:rPr>
-                <w:color w:val="4472C4" w:themeColor="accent1"/>
+                <w:color w:val="EE0000"/>
                 <w14:shadow w14:blurRad="38100" w14:dist="25400" w14:dir="5400000" w14:sx="100000" w14:sy="100000" w14:kx="0" w14:ky="0" w14:algn="ctr">
                   <w14:srgbClr w14:val="6E747A">
                     <w14:alpha w14:val="57000"/>
@@ -1188,7 +1138,7 @@
             <w:r>
               <w:rPr>
                 <w:rFonts w:ascii="Courier New" w:eastAsia="Courier New" w:hAnsi="Courier New" w:cs="Courier New"/>
-                <w:color w:val="4472C4" w:themeColor="accent1"/>
+                <w:color w:val="EE0000"/>
                 <w:sz w:val="18"/>
                 <w:szCs w:val="18"/>
                 <w14:shadow w14:blurRad="38100" w14:dist="25400" w14:dir="5400000" w14:sx="100000" w14:sy="100000" w14:kx="0" w14:ky="0" w14:algn="ctr">
@@ -1207,7 +1157,7 @@
             <w:r>
               <w:rPr>
                 <w:rFonts w:ascii="Courier New" w:eastAsia="Courier New" w:hAnsi="Courier New" w:cs="Courier New"/>
-                <w:color w:val="4472C4" w:themeColor="accent1"/>
+                <w:color w:val="EE0000"/>
                 <w:sz w:val="18"/>
                 <w:szCs w:val="18"/>
                 <w14:shadow w14:blurRad="38100" w14:dist="25400" w14:dir="5400000" w14:sx="100000" w14:sy="100000" w14:kx="0" w14:ky="0" w14:algn="ctr">
@@ -1226,7 +1176,7 @@
             <w:r>
               <w:rPr>
                 <w:rFonts w:ascii="Courier New" w:eastAsia="Courier New" w:hAnsi="Courier New" w:cs="Courier New"/>
-                <w:color w:val="4472C4" w:themeColor="accent1"/>
+                <w:color w:val="EE0000"/>
                 <w:sz w:val="18"/>
                 <w:szCs w:val="18"/>
                 <w14:shadow w14:blurRad="38100" w14:dist="25400" w14:dir="5400000" w14:sx="100000" w14:sy="100000" w14:kx="0" w14:ky="0" w14:algn="ctr">
@@ -1244,11 +1194,16 @@
             </w:r>
           </w:p>
           <w:p>
+            <w:pPr>
+              <w:rPr>
+                <w:color w:val="EE0000"/>
+              </w:rPr>
+            </w:pPr>
             <w:r>
               <w:rPr>
                 <w:i/>
                 <w:iCs/>
-                <w:color w:val="4472C4" w:themeColor="accent1"/>
+                <w:color w:val="EE0000"/>
                 <w:sz w:val="22"/>
                 <w:szCs w:val="22"/>
                 <w14:shadow w14:blurRad="38100" w14:dist="25400" w14:dir="5400000" w14:sx="100000" w14:sy="100000" w14:kx="0" w14:ky="0" w14:algn="ctr">
@@ -1268,7 +1223,7 @@
               <w:rPr>
                 <w:i/>
                 <w:iCs/>
-                <w:color w:val="4472C4" w:themeColor="accent1"/>
+                <w:color w:val="EE0000"/>
                 <w:sz w:val="22"/>
                 <w:szCs w:val="22"/>
                 <w14:shadow w14:blurRad="38100" w14:dist="25400" w14:dir="5400000" w14:sx="100000" w14:sy="100000" w14:kx="0" w14:ky="0" w14:algn="ctr">
@@ -1288,7 +1243,7 @@
               <w:rPr>
                 <w:i/>
                 <w:iCs/>
-                <w:color w:val="4472C4" w:themeColor="accent1"/>
+                <w:color w:val="EE0000"/>
                 <w:sz w:val="22"/>
                 <w:szCs w:val="22"/>
                 <w14:shadow w14:blurRad="38100" w14:dist="25400" w14:dir="5400000" w14:sx="100000" w14:sy="100000" w14:kx="0" w14:ky="0" w14:algn="ctr">
@@ -1308,6 +1263,7 @@
               <w:rPr>
                 <w:i/>
                 <w:iCs/>
+                <w:color w:val="EE0000"/>
                 <w:sz w:val="22"/>
                 <w:szCs w:val="22"/>
               </w:rPr>
@@ -1320,6 +1276,9 @@
     <w:p>
       <w:pPr>
         <w:spacing w:after="120"/>
+        <w:rPr>
+          <w:color w:val="EE0000"/>
+        </w:rPr>
       </w:pPr>
     </w:p>
     <w:tbl>
@@ -1366,12 +1325,17 @@
             </w:tcMar>
           </w:tcPr>
           <w:p>
+            <w:pPr>
+              <w:rPr>
+                <w:color w:val="EE0000"/>
+              </w:rPr>
+            </w:pPr>
             <w:r>
               <w:rPr>
                 <w:rFonts w:ascii="Courier New" w:eastAsia="Courier New" w:hAnsi="Courier New" w:cs="Courier New"/>
                 <w:b/>
                 <w:bCs/>
-                <w:color w:val="666666"/>
+                <w:color w:val="EE0000"/>
                 <w:sz w:val="18"/>
                 <w:szCs w:val="18"/>
               </w:rPr>
@@ -1397,12 +1361,17 @@
             </w:tcMar>
           </w:tcPr>
           <w:p>
+            <w:pPr>
+              <w:rPr>
+                <w:color w:val="EE0000"/>
+              </w:rPr>
+            </w:pPr>
             <w:r>
               <w:rPr>
                 <w:rFonts w:ascii="Courier New" w:eastAsia="Courier New" w:hAnsi="Courier New" w:cs="Courier New"/>
                 <w:b/>
                 <w:bCs/>
-                <w:color w:val="666666"/>
+                <w:color w:val="EE0000"/>
                 <w:sz w:val="18"/>
                 <w:szCs w:val="18"/>
               </w:rPr>
@@ -1428,12 +1397,17 @@
             </w:tcMar>
           </w:tcPr>
           <w:p>
+            <w:pPr>
+              <w:rPr>
+                <w:color w:val="EE0000"/>
+              </w:rPr>
+            </w:pPr>
             <w:r>
               <w:rPr>
                 <w:rFonts w:ascii="Courier New" w:eastAsia="Courier New" w:hAnsi="Courier New" w:cs="Courier New"/>
                 <w:b/>
                 <w:bCs/>
-                <w:color w:val="666666"/>
+                <w:color w:val="EE0000"/>
                 <w:sz w:val="18"/>
                 <w:szCs w:val="18"/>
               </w:rPr>
@@ -1460,8 +1434,14 @@
             </w:tcMar>
           </w:tcPr>
           <w:p>
-            <w:r>
-              <w:rPr>
+            <w:pPr>
+              <w:rPr>
+                <w:color w:val="EE0000"/>
+              </w:rPr>
+            </w:pPr>
+            <w:r>
+              <w:rPr>
+                <w:color w:val="EE0000"/>
                 <w:sz w:val="22"/>
                 <w:szCs w:val="22"/>
               </w:rPr>
@@ -1486,8 +1466,14 @@
             </w:tcMar>
           </w:tcPr>
           <w:p>
-            <w:r>
-              <w:rPr>
+            <w:pPr>
+              <w:rPr>
+                <w:color w:val="EE0000"/>
+              </w:rPr>
+            </w:pPr>
+            <w:r>
+              <w:rPr>
+                <w:color w:val="EE0000"/>
                 <w:sz w:val="22"/>
                 <w:szCs w:val="22"/>
               </w:rPr>
@@ -1512,8 +1498,14 @@
             </w:tcMar>
           </w:tcPr>
           <w:p>
-            <w:r>
-              <w:rPr>
+            <w:pPr>
+              <w:rPr>
+                <w:color w:val="EE0000"/>
+              </w:rPr>
+            </w:pPr>
+            <w:r>
+              <w:rPr>
+                <w:color w:val="EE0000"/>
                 <w:sz w:val="22"/>
                 <w:szCs w:val="22"/>
               </w:rPr>
@@ -1540,8 +1532,14 @@
             </w:tcMar>
           </w:tcPr>
           <w:p>
-            <w:r>
-              <w:rPr>
+            <w:pPr>
+              <w:rPr>
+                <w:color w:val="EE0000"/>
+              </w:rPr>
+            </w:pPr>
+            <w:r>
+              <w:rPr>
+                <w:color w:val="EE0000"/>
                 <w:sz w:val="22"/>
                 <w:szCs w:val="22"/>
               </w:rPr>
@@ -1566,8 +1564,14 @@
             </w:tcMar>
           </w:tcPr>
           <w:p>
-            <w:r>
-              <w:rPr>
+            <w:pPr>
+              <w:rPr>
+                <w:color w:val="EE0000"/>
+              </w:rPr>
+            </w:pPr>
+            <w:r>
+              <w:rPr>
+                <w:color w:val="EE0000"/>
                 <w:sz w:val="22"/>
                 <w:szCs w:val="22"/>
               </w:rPr>
@@ -1592,8 +1596,14 @@
             </w:tcMar>
           </w:tcPr>
           <w:p>
-            <w:r>
-              <w:rPr>
+            <w:pPr>
+              <w:rPr>
+                <w:color w:val="EE0000"/>
+              </w:rPr>
+            </w:pPr>
+            <w:r>
+              <w:rPr>
+                <w:color w:val="EE0000"/>
                 <w:sz w:val="22"/>
                 <w:szCs w:val="22"/>
               </w:rPr>
@@ -1620,8 +1630,14 @@
             </w:tcMar>
           </w:tcPr>
           <w:p>
-            <w:r>
-              <w:rPr>
+            <w:pPr>
+              <w:rPr>
+                <w:color w:val="EE0000"/>
+              </w:rPr>
+            </w:pPr>
+            <w:r>
+              <w:rPr>
+                <w:color w:val="EE0000"/>
                 <w:sz w:val="22"/>
                 <w:szCs w:val="22"/>
               </w:rPr>
@@ -1646,8 +1662,14 @@
             </w:tcMar>
           </w:tcPr>
           <w:p>
-            <w:r>
-              <w:rPr>
+            <w:pPr>
+              <w:rPr>
+                <w:color w:val="EE0000"/>
+              </w:rPr>
+            </w:pPr>
+            <w:r>
+              <w:rPr>
+                <w:color w:val="EE0000"/>
                 <w:sz w:val="22"/>
                 <w:szCs w:val="22"/>
               </w:rPr>
@@ -1672,8 +1694,14 @@
             </w:tcMar>
           </w:tcPr>
           <w:p>
-            <w:r>
-              <w:rPr>
+            <w:pPr>
+              <w:rPr>
+                <w:color w:val="EE0000"/>
+              </w:rPr>
+            </w:pPr>
+            <w:r>
+              <w:rPr>
+                <w:color w:val="EE0000"/>
                 <w:sz w:val="22"/>
                 <w:szCs w:val="22"/>
               </w:rPr>
@@ -1690,14 +1718,6 @@
     </w:p>
     <w:p>
       <w:pPr>
-        <w:pBdr>
-          <w:bottom w:val="single" w:sz="2" w:space="1" w:color="E0E0E0"/>
-        </w:pBdr>
-        <w:spacing w:before="200" w:after="200"/>
-      </w:pPr>
-    </w:p>
-    <w:p>
-      <w:pPr>
         <w:spacing w:before="360" w:after="60"/>
       </w:pPr>
       <w:r>
@@ -1726,7 +1746,6 @@
         <w:spacing w:before="80" w:after="160"/>
       </w:pPr>
       <w:r>
-        <w:lastRenderedPageBreak/>
         <w:t xml:space="preserve">The sensor has captured either a capacitance grid, a camera image, or a 3D sound map. Now what? This is where the real work happens </w:t>
       </w:r>
       <w:r>
@@ -1826,6 +1845,7 @@
                 <w:sz w:val="22"/>
                 <w:szCs w:val="22"/>
               </w:rPr>
+              <w:lastRenderedPageBreak/>
               <w:t xml:space="preserve">The raw sensor data is cleaned up. Real-world fingerprints are messy </w:t>
             </w:r>
             <w:r>
@@ -2303,49 +2323,7 @@
                   <w14:round/>
                 </w14:textOutline>
               </w:rPr>
-              <w:t xml:space="preserve">The system doesn't require </w:t>
-            </w:r>
-            <w:proofErr w:type="gramStart"/>
-            <w:r>
-              <w:rPr>
-                <w:i/>
-                <w:iCs/>
-                <w:color w:val="4472C4" w:themeColor="accent1"/>
-                <w:sz w:val="22"/>
-                <w:szCs w:val="22"/>
-                <w14:shadow w14:blurRad="38100" w14:dist="25400" w14:dir="5400000" w14:sx="100000" w14:sy="100000" w14:kx="0" w14:ky="0" w14:algn="ctr">
-                  <w14:srgbClr w14:val="6E747A">
-                    <w14:alpha w14:val="57000"/>
-                  </w14:srgbClr>
-                </w14:shadow>
-                <w14:textOutline w14:w="0" w14:cap="flat" w14:cmpd="sng" w14:algn="ctr">
-                  <w14:noFill/>
-                  <w14:prstDash w14:val="solid"/>
-                  <w14:round/>
-                </w14:textOutline>
-              </w:rPr>
-              <w:t>every</w:t>
-            </w:r>
-            <w:proofErr w:type="gramEnd"/>
-            <w:r>
-              <w:rPr>
-                <w:i/>
-                <w:iCs/>
-                <w:color w:val="4472C4" w:themeColor="accent1"/>
-                <w:sz w:val="22"/>
-                <w:szCs w:val="22"/>
-                <w14:shadow w14:blurRad="38100" w14:dist="25400" w14:dir="5400000" w14:sx="100000" w14:sy="100000" w14:kx="0" w14:ky="0" w14:algn="ctr">
-                  <w14:srgbClr w14:val="6E747A">
-                    <w14:alpha w14:val="57000"/>
-                  </w14:srgbClr>
-                </w14:shadow>
-                <w14:textOutline w14:w="0" w14:cap="flat" w14:cmpd="sng" w14:algn="ctr">
-                  <w14:noFill/>
-                  <w14:prstDash w14:val="solid"/>
-                  <w14:round/>
-                </w14:textOutline>
-              </w:rPr>
-              <w:t xml:space="preserve"> minutiae point to match. Matching just 12–15 points in the correct geometric relationship is usually enough for a confident identification. Requiring all points would make the system too rigid to handle real-world variation in how your finger lands each time.</w:t>
+              <w:t>The system doesn't require every minutiae point to match. Matching just 12–15 points in the correct geometric relationship is usually enough for a confident identification. Requiring all points would make the system too rigid to handle real-world variation in how your finger lands each time.</w:t>
             </w:r>
           </w:p>
         </w:tc>
@@ -2358,14 +2336,6 @@
     </w:p>
     <w:p>
       <w:pPr>
-        <w:pBdr>
-          <w:bottom w:val="single" w:sz="2" w:space="1" w:color="E0E0E0"/>
-        </w:pBdr>
-        <w:spacing w:before="200" w:after="200"/>
-      </w:pPr>
-    </w:p>
-    <w:p>
-      <w:pPr>
         <w:spacing w:before="360" w:after="60"/>
       </w:pPr>
       <w:r>
@@ -2394,49 +2364,49 @@
         <w:spacing w:before="80" w:after="160"/>
       </w:pPr>
       <w:r>
+        <w:t xml:space="preserve">Here's a question nobody asks but everyone should: once your phone "knows" your fingerprint, where does it store it? And is anyone </w:t>
+      </w:r>
+      <w:r>
+        <w:t>-</w:t>
+      </w:r>
+      <w:r>
+        <w:t xml:space="preserve"> your phone maker, an app, some server </w:t>
+      </w:r>
+      <w:r>
+        <w:t>-</w:t>
+      </w:r>
+      <w:r>
+        <w:t xml:space="preserve"> holding a copy?</w:t>
+      </w:r>
+    </w:p>
+    <w:p>
+      <w:pPr>
+        <w:spacing w:before="80" w:after="160"/>
+      </w:pPr>
+      <w:r>
+        <w:t xml:space="preserve">The answer is no </w:t>
+      </w:r>
+      <w:r>
+        <w:t>-</w:t>
+      </w:r>
+      <w:r>
+        <w:t xml:space="preserve"> or at least, it's supposed to be. Here's how modern phones handle this properly.</w:t>
+      </w:r>
+    </w:p>
+    <w:p>
+      <w:pPr>
+        <w:pStyle w:val="Heading3"/>
+      </w:pPr>
+      <w:r>
+        <w:t>The Secure Enclave</w:t>
+      </w:r>
+    </w:p>
+    <w:p>
+      <w:pPr>
+        <w:spacing w:before="80" w:after="160"/>
+      </w:pPr>
+      <w:r>
         <w:lastRenderedPageBreak/>
-        <w:t xml:space="preserve">Here's a question nobody asks but everyone should: once your phone "knows" your fingerprint, where does it store it? And is anyone </w:t>
-      </w:r>
-      <w:r>
-        <w:t>-</w:t>
-      </w:r>
-      <w:r>
-        <w:t xml:space="preserve"> your phone maker, an app, some server </w:t>
-      </w:r>
-      <w:r>
-        <w:t>-</w:t>
-      </w:r>
-      <w:r>
-        <w:t xml:space="preserve"> holding a copy?</w:t>
-      </w:r>
-    </w:p>
-    <w:p>
-      <w:pPr>
-        <w:spacing w:before="80" w:after="160"/>
-      </w:pPr>
-      <w:r>
-        <w:t xml:space="preserve">The answer is no </w:t>
-      </w:r>
-      <w:r>
-        <w:t>-</w:t>
-      </w:r>
-      <w:r>
-        <w:t xml:space="preserve"> or at least, it's supposed to be. Here's how modern phones handle this properly.</w:t>
-      </w:r>
-    </w:p>
-    <w:p>
-      <w:pPr>
-        <w:pStyle w:val="Heading3"/>
-      </w:pPr>
-      <w:r>
-        <w:t>The Secure Enclave</w:t>
-      </w:r>
-    </w:p>
-    <w:p>
-      <w:pPr>
-        <w:spacing w:before="80" w:after="160"/>
-      </w:pPr>
-      <w:r>
         <w:t xml:space="preserve">Your fingerprint template </w:t>
       </w:r>
       <w:r>
@@ -2601,49 +2571,7 @@
                   <w14:round/>
                 </w14:textOutline>
               </w:rPr>
-              <w:t xml:space="preserve">It's like a bank with a vault inside it. The staff can tell you </w:t>
-            </w:r>
-            <w:proofErr w:type="gramStart"/>
-            <w:r>
-              <w:rPr>
-                <w:i/>
-                <w:iCs/>
-                <w:color w:val="4472C4" w:themeColor="accent1"/>
-                <w:sz w:val="22"/>
-                <w:szCs w:val="22"/>
-                <w14:shadow w14:blurRad="38100" w14:dist="25400" w14:dir="5400000" w14:sx="100000" w14:sy="100000" w14:kx="0" w14:ky="0" w14:algn="ctr">
-                  <w14:srgbClr w14:val="6E747A">
-                    <w14:alpha w14:val="57000"/>
-                  </w14:srgbClr>
-                </w14:shadow>
-                <w14:textOutline w14:w="0" w14:cap="flat" w14:cmpd="sng" w14:algn="ctr">
-                  <w14:noFill/>
-                  <w14:prstDash w14:val="solid"/>
-                  <w14:round/>
-                </w14:textOutline>
-              </w:rPr>
-              <w:t>"yes</w:t>
-            </w:r>
-            <w:proofErr w:type="gramEnd"/>
-            <w:r>
-              <w:rPr>
-                <w:i/>
-                <w:iCs/>
-                <w:color w:val="4472C4" w:themeColor="accent1"/>
-                <w:sz w:val="22"/>
-                <w:szCs w:val="22"/>
-                <w14:shadow w14:blurRad="38100" w14:dist="25400" w14:dir="5400000" w14:sx="100000" w14:sy="100000" w14:kx="0" w14:ky="0" w14:algn="ctr">
-                  <w14:srgbClr w14:val="6E747A">
-                    <w14:alpha w14:val="57000"/>
-                  </w14:srgbClr>
-                </w14:shadow>
-                <w14:textOutline w14:w="0" w14:cap="flat" w14:cmpd="sng" w14:algn="ctr">
-                  <w14:noFill/>
-                  <w14:prstDash w14:val="solid"/>
-                  <w14:round/>
-                </w14:textOutline>
-              </w:rPr>
-              <w:t xml:space="preserve">, approved" or "no, rejected" </w:t>
+              <w:t xml:space="preserve">It's like a bank with a vault inside it. The staff can tell you "yes, approved" or "no, rejected" </w:t>
             </w:r>
             <w:r>
               <w:rPr>
@@ -3367,82 +3295,131 @@
     </w:p>
     <w:p>
       <w:pPr>
-        <w:pBdr>
-          <w:bottom w:val="single" w:sz="2" w:space="1" w:color="E0E0E0"/>
-        </w:pBdr>
-        <w:spacing w:before="200" w:after="200"/>
-      </w:pPr>
-    </w:p>
-    <w:p>
-      <w:pPr>
         <w:spacing w:before="360" w:after="60"/>
       </w:pPr>
       <w:r>
         <w:rPr>
           <w:rFonts w:ascii="Courier New" w:eastAsia="Courier New" w:hAnsi="Courier New" w:cs="Courier New"/>
         </w:rPr>
-        <w:t>SECTION 05</w:t>
+        <w:t>SEC</w:t>
+      </w:r>
+      <w:r>
+        <w:rPr>
+          <w:rFonts w:ascii="Courier New" w:eastAsia="Courier New" w:hAnsi="Courier New" w:cs="Courier New"/>
+        </w:rPr>
+        <w:t>TION 05</w:t>
       </w:r>
     </w:p>
     <w:p>
       <w:pPr>
         <w:pStyle w:val="Heading2"/>
-      </w:pPr>
-      <w:r>
+        <w:rPr>
+          <w:color w:val="EE0000"/>
+        </w:rPr>
+      </w:pPr>
+      <w:r>
+        <w:rPr>
+          <w:color w:val="EE0000"/>
+        </w:rPr>
         <w:t xml:space="preserve">Bigger Picture </w:t>
       </w:r>
       <w:r>
+        <w:rPr>
+          <w:color w:val="EE0000"/>
+        </w:rPr>
         <w:t>-</w:t>
       </w:r>
       <w:r>
+        <w:rPr>
+          <w:color w:val="EE0000"/>
+        </w:rPr>
         <w:t xml:space="preserve"> Biometrics Beyond the Thumb</w:t>
       </w:r>
     </w:p>
     <w:p>
       <w:pPr>
         <w:spacing w:before="80" w:after="160"/>
-      </w:pPr>
-      <w:r>
+        <w:rPr>
+          <w:color w:val="EE0000"/>
+        </w:rPr>
+      </w:pPr>
+      <w:r>
+        <w:rPr>
+          <w:color w:val="EE0000"/>
+        </w:rPr>
         <w:t>Fingerprint recognition is the most common biometric on phones right now, but it's far from the only one. And understanding fingerprints gives you the foundation to understand all of them.</w:t>
       </w:r>
     </w:p>
     <w:p>
       <w:pPr>
         <w:spacing w:before="80" w:after="160"/>
-      </w:pPr>
-      <w:r>
+        <w:rPr>
+          <w:color w:val="EE0000"/>
+        </w:rPr>
+      </w:pPr>
+      <w:r>
+        <w:rPr>
+          <w:color w:val="EE0000"/>
+        </w:rPr>
         <w:t xml:space="preserve">Face unlock uses infrared cameras and depth sensors to extract features from your face </w:t>
       </w:r>
       <w:r>
+        <w:rPr>
+          <w:color w:val="EE0000"/>
+        </w:rPr>
         <w:t>-</w:t>
       </w:r>
       <w:r>
+        <w:rPr>
+          <w:color w:val="EE0000"/>
+        </w:rPr>
         <w:t xml:space="preserve"> the distance between your eyes, the shape of your nose bridge, the geometry of your jaw </w:t>
       </w:r>
       <w:r>
+        <w:rPr>
+          <w:color w:val="EE0000"/>
+        </w:rPr>
         <w:t>-</w:t>
       </w:r>
       <w:r>
+        <w:rPr>
+          <w:color w:val="EE0000"/>
+        </w:rPr>
         <w:t xml:space="preserve"> and matches them against a stored template. Same pipeline: capture → extract → match → decide.</w:t>
       </w:r>
     </w:p>
     <w:p>
       <w:pPr>
         <w:spacing w:before="80" w:after="160"/>
-      </w:pPr>
-      <w:r>
+        <w:rPr>
+          <w:color w:val="EE0000"/>
+        </w:rPr>
+      </w:pPr>
+      <w:r>
+        <w:rPr>
+          <w:color w:val="EE0000"/>
+        </w:rPr>
         <w:t xml:space="preserve">Iris scanning, used in some Samsung devices, fires near-infrared light at your eye and captures the texture of your iris </w:t>
       </w:r>
       <w:r>
+        <w:rPr>
+          <w:color w:val="EE0000"/>
+        </w:rPr>
         <w:t>-</w:t>
       </w:r>
       <w:r>
+        <w:rPr>
+          <w:color w:val="EE0000"/>
+        </w:rPr>
         <w:t xml:space="preserve"> which, like fingerprints, is unique to each person and stable for life.</w:t>
       </w:r>
     </w:p>
     <w:p>
       <w:pPr>
         <w:spacing w:after="120"/>
+        <w:rPr>
+          <w:color w:val="EE0000"/>
+        </w:rPr>
       </w:pPr>
     </w:p>
     <w:tbl>
@@ -3487,7 +3464,7 @@
             <w:pPr>
               <w:spacing w:after="60"/>
               <w:rPr>
-                <w:color w:val="4472C4" w:themeColor="accent1"/>
+                <w:color w:val="EE0000"/>
                 <w14:shadow w14:blurRad="38100" w14:dist="25400" w14:dir="5400000" w14:sx="100000" w14:sy="100000" w14:kx="0" w14:ky="0" w14:algn="ctr">
                   <w14:srgbClr w14:val="6E747A">
                     <w14:alpha w14:val="57000"/>
@@ -3503,7 +3480,7 @@
             <w:r>
               <w:rPr>
                 <w:rFonts w:ascii="Courier New" w:eastAsia="Courier New" w:hAnsi="Courier New" w:cs="Courier New"/>
-                <w:color w:val="4472C4" w:themeColor="accent1"/>
+                <w:color w:val="EE0000"/>
                 <w:sz w:val="18"/>
                 <w:szCs w:val="18"/>
                 <w14:shadow w14:blurRad="38100" w14:dist="25400" w14:dir="5400000" w14:sx="100000" w14:sy="100000" w14:kx="0" w14:ky="0" w14:algn="ctr">
@@ -3523,7 +3500,7 @@
           <w:p>
             <w:pPr>
               <w:rPr>
-                <w:color w:val="4472C4" w:themeColor="accent1"/>
+                <w:color w:val="EE0000"/>
                 <w14:shadow w14:blurRad="38100" w14:dist="25400" w14:dir="5400000" w14:sx="100000" w14:sy="100000" w14:kx="0" w14:ky="0" w14:algn="ctr">
                   <w14:srgbClr w14:val="6E747A">
                     <w14:alpha w14:val="57000"/>
@@ -3540,7 +3517,7 @@
               <w:rPr>
                 <w:i/>
                 <w:iCs/>
-                <w:color w:val="4472C4" w:themeColor="accent1"/>
+                <w:color w:val="EE0000"/>
                 <w:sz w:val="22"/>
                 <w:szCs w:val="22"/>
                 <w14:shadow w14:blurRad="38100" w14:dist="25400" w14:dir="5400000" w14:sx="100000" w14:sy="100000" w14:kx="0" w14:ky="0" w14:algn="ctr">
@@ -3560,7 +3537,7 @@
               <w:rPr>
                 <w:i/>
                 <w:iCs/>
-                <w:color w:val="4472C4" w:themeColor="accent1"/>
+                <w:color w:val="EE0000"/>
                 <w:sz w:val="22"/>
                 <w:szCs w:val="22"/>
                 <w14:shadow w14:blurRad="38100" w14:dist="25400" w14:dir="5400000" w14:sx="100000" w14:sy="100000" w14:kx="0" w14:ky="0" w14:algn="ctr">
@@ -3580,7 +3557,7 @@
               <w:rPr>
                 <w:i/>
                 <w:iCs/>
-                <w:color w:val="4472C4" w:themeColor="accent1"/>
+                <w:color w:val="EE0000"/>
                 <w:sz w:val="22"/>
                 <w:szCs w:val="22"/>
                 <w14:shadow w14:blurRad="38100" w14:dist="25400" w14:dir="5400000" w14:sx="100000" w14:sy="100000" w14:kx="0" w14:ky="0" w14:algn="ctr">
@@ -3600,7 +3577,7 @@
               <w:rPr>
                 <w:i/>
                 <w:iCs/>
-                <w:color w:val="4472C4" w:themeColor="accent1"/>
+                <w:color w:val="EE0000"/>
                 <w:sz w:val="22"/>
                 <w:szCs w:val="22"/>
                 <w14:shadow w14:blurRad="38100" w14:dist="25400" w14:dir="5400000" w14:sx="100000" w14:sy="100000" w14:kx="0" w14:ky="0" w14:algn="ctr">
@@ -3620,7 +3597,7 @@
               <w:rPr>
                 <w:i/>
                 <w:iCs/>
-                <w:color w:val="4472C4" w:themeColor="accent1"/>
+                <w:color w:val="EE0000"/>
                 <w:sz w:val="22"/>
                 <w:szCs w:val="22"/>
                 <w14:shadow w14:blurRad="38100" w14:dist="25400" w14:dir="5400000" w14:sx="100000" w14:sy="100000" w14:kx="0" w14:ky="0" w14:algn="ctr">
@@ -3644,7 +3621,7 @@
       <w:pPr>
         <w:spacing w:after="120"/>
         <w:rPr>
-          <w:color w:val="4472C4" w:themeColor="accent1"/>
+          <w:color w:val="EE0000"/>
           <w14:shadow w14:blurRad="38100" w14:dist="25400" w14:dir="5400000" w14:sx="100000" w14:sy="100000" w14:kx="0" w14:ky="0" w14:algn="ctr">
             <w14:srgbClr w14:val="6E747A">
               <w14:alpha w14:val="57000"/>
@@ -3661,81 +3638,97 @@
     <w:p>
       <w:pPr>
         <w:pStyle w:val="Heading3"/>
-      </w:pPr>
-      <w:r>
+        <w:rPr>
+          <w:color w:val="EE0000"/>
+        </w:rPr>
+      </w:pPr>
+      <w:r>
+        <w:rPr>
+          <w:color w:val="EE0000"/>
+        </w:rPr>
         <w:t xml:space="preserve">Liveness detection </w:t>
       </w:r>
       <w:r>
+        <w:rPr>
+          <w:color w:val="EE0000"/>
+        </w:rPr>
         <w:t>-</w:t>
       </w:r>
       <w:r>
+        <w:rPr>
+          <w:color w:val="EE0000"/>
+        </w:rPr>
         <w:t xml:space="preserve"> stopping fakes</w:t>
       </w:r>
     </w:p>
     <w:p>
       <w:pPr>
         <w:spacing w:before="80" w:after="160"/>
-      </w:pPr>
-      <w:r>
-        <w:t xml:space="preserve">Could someone unlock your phone with a photo of your fingerprint? Or a silicone </w:t>
-      </w:r>
-      <w:proofErr w:type="spellStart"/>
-      <w:r>
-        <w:t>mold</w:t>
-      </w:r>
-      <w:proofErr w:type="spellEnd"/>
-      <w:r>
-        <w:t xml:space="preserve">? This is called a </w:t>
+        <w:rPr>
+          <w:color w:val="EE0000"/>
+        </w:rPr>
+      </w:pPr>
+      <w:r>
+        <w:rPr>
+          <w:color w:val="EE0000"/>
+        </w:rPr>
+        <w:t xml:space="preserve">Could someone unlock your phone with a photo of your fingerprint? Or a silicone mold? This is called a </w:t>
       </w:r>
       <w:r>
         <w:rPr>
           <w:b/>
           <w:bCs/>
+          <w:color w:val="EE0000"/>
         </w:rPr>
         <w:t>spoof attack</w:t>
       </w:r>
       <w:r>
+        <w:rPr>
+          <w:color w:val="EE0000"/>
+        </w:rPr>
         <w:t xml:space="preserve">, and it's a real concern. Modern sensors fight back with liveness detection </w:t>
       </w:r>
       <w:r>
+        <w:rPr>
+          <w:color w:val="EE0000"/>
+        </w:rPr>
         <w:t>-</w:t>
       </w:r>
       <w:r>
+        <w:rPr>
+          <w:color w:val="EE0000"/>
+        </w:rPr>
         <w:t xml:space="preserve"> verifying that what's being scanned is an actual living finger.</w:t>
       </w:r>
     </w:p>
     <w:p>
       <w:pPr>
         <w:spacing w:before="80" w:after="160"/>
-      </w:pPr>
-      <w:r>
-        <w:t xml:space="preserve">Capacitive sensors detect subtle electrical properties only real skin produces. Ultrasonic sensors check the acoustic characteristics of live tissue. Optical sensors </w:t>
-      </w:r>
-      <w:proofErr w:type="spellStart"/>
-      <w:r>
-        <w:t>analyze</w:t>
-      </w:r>
-      <w:proofErr w:type="spellEnd"/>
-      <w:r>
-        <w:t xml:space="preserve"> multiple frames looking for tiny natural movements. It's an ongoing back-and-forth </w:t>
-      </w:r>
-      <w:r>
+        <w:rPr>
+          <w:color w:val="EE0000"/>
+        </w:rPr>
+      </w:pPr>
+      <w:r>
+        <w:rPr>
+          <w:color w:val="EE0000"/>
+        </w:rPr>
+        <w:t xml:space="preserve">Capacitive sensors detect subtle electrical properties only real skin produces. Ultrasonic sensors check the acoustic characteristics of live tissue. Optical sensors analyze multiple frames looking for tiny natural movements. It's an ongoing back-and-forth </w:t>
+      </w:r>
+      <w:r>
+        <w:rPr>
+          <w:color w:val="EE0000"/>
+        </w:rPr>
         <w:t>-</w:t>
       </w:r>
       <w:r>
+        <w:rPr>
+          <w:color w:val="EE0000"/>
+        </w:rPr>
         <w:t xml:space="preserve"> sensors improve, attacks get cleverer, sensors improve again.</w:t>
       </w:r>
     </w:p>
     <w:p>
       <w:pPr>
-        <w:pBdr>
-          <w:bottom w:val="single" w:sz="2" w:space="1" w:color="E0E0E0"/>
-        </w:pBdr>
-        <w:spacing w:before="200" w:after="200"/>
-      </w:pPr>
-    </w:p>
-    <w:p>
-      <w:pPr>
         <w:spacing w:before="360" w:after="60"/>
       </w:pPr>
       <w:r>
@@ -3749,13 +3742,8 @@
       <w:pPr>
         <w:pStyle w:val="Heading2"/>
       </w:pPr>
-      <w:proofErr w:type="gramStart"/>
-      <w:r>
-        <w:t>So</w:t>
-      </w:r>
-      <w:proofErr w:type="gramEnd"/>
-      <w:r>
-        <w:t xml:space="preserve"> What's Actually Happening in 0.3 Seconds?</w:t>
+      <w:r>
+        <w:t>So What's Actually Happening in 0.3 Seconds?</w:t>
       </w:r>
     </w:p>
     <w:p>
@@ -3830,6 +3818,7 @@
                 <w:sz w:val="40"/>
                 <w:szCs w:val="40"/>
               </w:rPr>
+              <w:lastRenderedPageBreak/>
               <w:t>①</w:t>
             </w:r>
           </w:p>
@@ -4315,14 +4304,6 @@
     </w:p>
     <w:p>
       <w:pPr>
-        <w:pBdr>
-          <w:bottom w:val="single" w:sz="2" w:space="1" w:color="E0E0E0"/>
-        </w:pBdr>
-        <w:spacing w:before="200" w:after="200"/>
-      </w:pPr>
-    </w:p>
-    <w:p>
-      <w:pPr>
         <w:spacing w:before="200" w:after="120"/>
       </w:pPr>
       <w:r>
@@ -4360,8 +4341,13 @@
         <w:t>-</w:t>
       </w:r>
       <w:r>
-        <w:t xml:space="preserve"> the rabbit hole goes much deeper. ⚡</w:t>
-      </w:r>
+        <w:t xml:space="preserve"> the rabbit hole goes much deeper. </w:t>
+      </w:r>
+    </w:p>
+    <w:p>
+      <w:pPr>
+        <w:spacing w:before="80" w:after="160"/>
+      </w:pPr>
     </w:p>
     <w:sectPr>
       <w:pgSz w:w="12240" w:h="15840"/>

</xml_diff>